<commit_message>
Update expected test files for Capella 7.1.0.
</commit_message>
<xml_diff>
--- a/tests/org.obeonetwork.capella.m2doc.aql.queries.tests/resources/IFE/LA-Complete/LA-Complete-expected-generation.docx
+++ b/tests/org.obeonetwork.capella.m2doc.aql.queries.tests/resources/IFE/LA-Complete/LA-Complete-expected-generation.docx
@@ -239,12 +239,12 @@
         <w:drawing>
           <wp:inline distT="0" distR="0" distB="0" distL="0">
             <wp:extent cx="5080000" cy="2006600"/>
-            <wp:docPr id="0" name="Drawing 0" descr="file:/tmp/%5BLCBD%5D%20Architecture%20Drivers-m2doc17835541174091406932.jpg"/>
+            <wp:docPr id="0" name="Drawing 0" descr="file:/tmp/%5BLCBD%5D%20Architecture%20Drivers-m2doc8706255952810448001.jpg"/>
             <a:graphic xmlns:a="http://schemas.openxmlformats.org/drawingml/2006/main">
               <a:graphicData uri="http://schemas.openxmlformats.org/drawingml/2006/picture">
                 <pic:pic xmlns:pic="http://schemas.openxmlformats.org/drawingml/2006/picture">
                   <pic:nvPicPr>
-                    <pic:cNvPr id="0" name="Picture 0" descr="file:/tmp/%5BLCBD%5D%20Architecture%20Drivers-m2doc17835541174091406932.jpg"/>
+                    <pic:cNvPr id="0" name="Picture 0" descr="file:/tmp/%5BLCBD%5D%20Architecture%20Drivers-m2doc8706255952810448001.jpg"/>
                     <pic:cNvPicPr>
                       <a:picLocks noChangeAspect="true"/>
                     </pic:cNvPicPr>
@@ -10815,12 +10815,12 @@
         <w:drawing>
           <wp:inline distT="0" distR="0" distB="0" distL="0">
             <wp:extent cx="5080000" cy="4064000"/>
-            <wp:docPr id="1" name="Drawing 1" descr="file:/tmp/%5BLDFB%5D%20Top%20Level%20Functions-m2doc9843794205007322762.jpg"/>
+            <wp:docPr id="1" name="Drawing 1" descr="file:/tmp/%5BLDFB%5D%20Top%20Level%20Functions-m2doc8594894399026688207.jpg"/>
             <a:graphic xmlns:a="http://schemas.openxmlformats.org/drawingml/2006/main">
               <a:graphicData uri="http://schemas.openxmlformats.org/drawingml/2006/picture">
                 <pic:pic xmlns:pic="http://schemas.openxmlformats.org/drawingml/2006/picture">
                   <pic:nvPicPr>
-                    <pic:cNvPr id="0" name="Picture 1" descr="file:/tmp/%5BLDFB%5D%20Top%20Level%20Functions-m2doc9843794205007322762.jpg"/>
+                    <pic:cNvPr id="0" name="Picture 1" descr="file:/tmp/%5BLDFB%5D%20Top%20Level%20Functions-m2doc8594894399026688207.jpg"/>
                     <pic:cNvPicPr>
                       <a:picLocks noChangeAspect="true"/>
                     </pic:cNvPicPr>
@@ -24201,12 +24201,12 @@
         <w:drawing>
           <wp:inline distT="0" distR="0" distB="0" distL="0">
             <wp:extent cx="5080000" cy="4406900"/>
-            <wp:docPr id="2" name="Drawing 2" descr="file:/tmp/%5BLDFB%5D%20%5BCTX%5D%20Provide%20Aircraft%20Interface-m2doc15176701776345644463.jpg"/>
+            <wp:docPr id="2" name="Drawing 2" descr="file:/tmp/%5BLDFB%5D%20%5BCTX%5D%20Provide%20Aircraft%20Interface-m2doc6542091409345584440.jpg"/>
             <a:graphic xmlns:a="http://schemas.openxmlformats.org/drawingml/2006/main">
               <a:graphicData uri="http://schemas.openxmlformats.org/drawingml/2006/picture">
                 <pic:pic xmlns:pic="http://schemas.openxmlformats.org/drawingml/2006/picture">
                   <pic:nvPicPr>
-                    <pic:cNvPr id="0" name="Picture 2" descr="file:/tmp/%5BLDFB%5D%20%5BCTX%5D%20Provide%20Aircraft%20Interface-m2doc15176701776345644463.jpg"/>
+                    <pic:cNvPr id="0" name="Picture 2" descr="file:/tmp/%5BLDFB%5D%20%5BCTX%5D%20Provide%20Aircraft%20Interface-m2doc6542091409345584440.jpg"/>
                     <pic:cNvPicPr>
                       <a:picLocks noChangeAspect="true"/>
                     </pic:cNvPicPr>
@@ -29876,12 +29876,12 @@
         <w:drawing>
           <wp:inline distT="0" distR="0" distB="0" distL="0">
             <wp:extent cx="5080000" cy="2832100"/>
-            <wp:docPr id="3" name="Drawing 3" descr="file:/tmp/%5BLDFB%5D%20%5BCTX%5D%20Manage%20Audio%20and%20Video%20Diffusion-m2doc5661055826309362318.jpg"/>
+            <wp:docPr id="3" name="Drawing 3" descr="file:/tmp/%5BLDFB%5D%20%5BCTX%5D%20Manage%20Audio%20and%20Video%20Diffusion-m2doc6828097229795023959.jpg"/>
             <a:graphic xmlns:a="http://schemas.openxmlformats.org/drawingml/2006/main">
               <a:graphicData uri="http://schemas.openxmlformats.org/drawingml/2006/picture">
                 <pic:pic xmlns:pic="http://schemas.openxmlformats.org/drawingml/2006/picture">
                   <pic:nvPicPr>
-                    <pic:cNvPr id="0" name="Picture 3" descr="file:/tmp/%5BLDFB%5D%20%5BCTX%5D%20Manage%20Audio%20and%20Video%20Diffusion-m2doc5661055826309362318.jpg"/>
+                    <pic:cNvPr id="0" name="Picture 3" descr="file:/tmp/%5BLDFB%5D%20%5BCTX%5D%20Manage%20Audio%20and%20Video%20Diffusion-m2doc6828097229795023959.jpg"/>
                     <pic:cNvPicPr>
                       <a:picLocks noChangeAspect="true"/>
                     </pic:cNvPicPr>
@@ -30370,12 +30370,12 @@
         <w:drawing>
           <wp:inline distT="0" distR="0" distB="0" distL="0">
             <wp:extent cx="5080000" cy="4089400"/>
-            <wp:docPr id="4" name="Drawing 4" descr="file:/tmp/%5BLDFB%5D%20%5BCTX%5D%20Process%20Audio%20Video%20Requests-m2doc17783028775090893877.jpg"/>
+            <wp:docPr id="4" name="Drawing 4" descr="file:/tmp/%5BLDFB%5D%20%5BCTX%5D%20Process%20Audio%20Video%20Requests-m2doc4251420389948046051.jpg"/>
             <a:graphic xmlns:a="http://schemas.openxmlformats.org/drawingml/2006/main">
               <a:graphicData uri="http://schemas.openxmlformats.org/drawingml/2006/picture">
                 <pic:pic xmlns:pic="http://schemas.openxmlformats.org/drawingml/2006/picture">
                   <pic:nvPicPr>
-                    <pic:cNvPr id="0" name="Picture 4" descr="file:/tmp/%5BLDFB%5D%20%5BCTX%5D%20Process%20Audio%20Video%20Requests-m2doc17783028775090893877.jpg"/>
+                    <pic:cNvPr id="0" name="Picture 4" descr="file:/tmp/%5BLDFB%5D%20%5BCTX%5D%20Process%20Audio%20Video%20Requests-m2doc4251420389948046051.jpg"/>
                     <pic:cNvPicPr>
                       <a:picLocks noChangeAspect="true"/>
                     </pic:cNvPicPr>
@@ -32574,12 +32574,12 @@
         <w:drawing>
           <wp:inline distT="0" distR="0" distB="0" distL="0">
             <wp:extent cx="5080000" cy="4025900"/>
-            <wp:docPr id="5" name="Drawing 5" descr="file:/tmp/%5BLDFB%5D%20%5BCTX%5D%20Broadcast%20Stored%20Audio%20Video%20Streams-m2doc1867638697601535771.jpg"/>
+            <wp:docPr id="5" name="Drawing 5" descr="file:/tmp/%5BLDFB%5D%20%5BCTX%5D%20Broadcast%20Stored%20Audio%20Video%20Streams-m2doc4327175561070047811.jpg"/>
             <a:graphic xmlns:a="http://schemas.openxmlformats.org/drawingml/2006/main">
               <a:graphicData uri="http://schemas.openxmlformats.org/drawingml/2006/picture">
                 <pic:pic xmlns:pic="http://schemas.openxmlformats.org/drawingml/2006/picture">
                   <pic:nvPicPr>
-                    <pic:cNvPr id="0" name="Picture 5" descr="file:/tmp/%5BLDFB%5D%20%5BCTX%5D%20Broadcast%20Stored%20Audio%20Video%20Streams-m2doc1867638697601535771.jpg"/>
+                    <pic:cNvPr id="0" name="Picture 5" descr="file:/tmp/%5BLDFB%5D%20%5BCTX%5D%20Broadcast%20Stored%20Audio%20Video%20Streams-m2doc4327175561070047811.jpg"/>
                     <pic:cNvPicPr>
                       <a:picLocks noChangeAspect="true"/>
                     </pic:cNvPicPr>
@@ -35077,12 +35077,12 @@
         <w:drawing>
           <wp:inline distT="0" distR="0" distB="0" distL="0">
             <wp:extent cx="5080000" cy="2387600"/>
-            <wp:docPr id="6" name="Drawing 6" descr="file:/tmp/%5BLDFB%5D%20%5BCTX%5D%20Display%20Video%20and%20Play%20Audio-m2doc16419335659016219971.jpg"/>
+            <wp:docPr id="6" name="Drawing 6" descr="file:/tmp/%5BLDFB%5D%20%5BCTX%5D%20Display%20Video%20and%20Play%20Audio-m2doc14235616944047986593.jpg"/>
             <a:graphic xmlns:a="http://schemas.openxmlformats.org/drawingml/2006/main">
               <a:graphicData uri="http://schemas.openxmlformats.org/drawingml/2006/picture">
                 <pic:pic xmlns:pic="http://schemas.openxmlformats.org/drawingml/2006/picture">
                   <pic:nvPicPr>
-                    <pic:cNvPr id="0" name="Picture 6" descr="file:/tmp/%5BLDFB%5D%20%5BCTX%5D%20Display%20Video%20and%20Play%20Audio-m2doc16419335659016219971.jpg"/>
+                    <pic:cNvPr id="0" name="Picture 6" descr="file:/tmp/%5BLDFB%5D%20%5BCTX%5D%20Display%20Video%20and%20Play%20Audio-m2doc14235616944047986593.jpg"/>
                     <pic:cNvPicPr>
                       <a:picLocks noChangeAspect="true"/>
                     </pic:cNvPicPr>
@@ -40081,12 +40081,12 @@
         <w:drawing>
           <wp:inline distT="0" distR="0" distB="0" distL="0">
             <wp:extent cx="5080000" cy="2387600"/>
-            <wp:docPr id="7" name="Drawing 7" descr="file:/tmp/%5BLDFB%5D%20%5BCTX%5D%20Run%20Passenger%20Services-m2doc918231693395858327.jpg"/>
+            <wp:docPr id="7" name="Drawing 7" descr="file:/tmp/%5BLDFB%5D%20%5BCTX%5D%20Run%20Passenger%20Services-m2doc12578929264173839430.jpg"/>
             <a:graphic xmlns:a="http://schemas.openxmlformats.org/drawingml/2006/main">
               <a:graphicData uri="http://schemas.openxmlformats.org/drawingml/2006/picture">
                 <pic:pic xmlns:pic="http://schemas.openxmlformats.org/drawingml/2006/picture">
                   <pic:nvPicPr>
-                    <pic:cNvPr id="0" name="Picture 7" descr="file:/tmp/%5BLDFB%5D%20%5BCTX%5D%20Run%20Passenger%20Services-m2doc918231693395858327.jpg"/>
+                    <pic:cNvPr id="0" name="Picture 7" descr="file:/tmp/%5BLDFB%5D%20%5BCTX%5D%20Run%20Passenger%20Services-m2doc12578929264173839430.jpg"/>
                     <pic:cNvPicPr>
                       <a:picLocks noChangeAspect="true"/>
                     </pic:cNvPicPr>
@@ -40545,12 +40545,12 @@
         <w:drawing>
           <wp:inline distT="0" distR="0" distB="0" distL="0">
             <wp:extent cx="5080000" cy="3556000"/>
-            <wp:docPr id="8" name="Drawing 8" descr="file:/tmp/%5BLDFB%5D%20%5BCTX%5D%20Run%20Video-On-Demand%20Service-m2doc13933499686453272342.jpg"/>
+            <wp:docPr id="8" name="Drawing 8" descr="file:/tmp/%5BLDFB%5D%20%5BCTX%5D%20Run%20Video-On-Demand%20Service-m2doc2566513563723777029.jpg"/>
             <a:graphic xmlns:a="http://schemas.openxmlformats.org/drawingml/2006/main">
               <a:graphicData uri="http://schemas.openxmlformats.org/drawingml/2006/picture">
                 <pic:pic xmlns:pic="http://schemas.openxmlformats.org/drawingml/2006/picture">
                   <pic:nvPicPr>
-                    <pic:cNvPr id="0" name="Picture 8" descr="file:/tmp/%5BLDFB%5D%20%5BCTX%5D%20Run%20Video-On-Demand%20Service-m2doc13933499686453272342.jpg"/>
+                    <pic:cNvPr id="0" name="Picture 8" descr="file:/tmp/%5BLDFB%5D%20%5BCTX%5D%20Run%20Video-On-Demand%20Service-m2doc2566513563723777029.jpg"/>
                     <pic:cNvPicPr>
                       <a:picLocks noChangeAspect="true"/>
                     </pic:cNvPicPr>
@@ -46578,12 +46578,12 @@
         <w:drawing>
           <wp:inline distT="0" distR="0" distB="0" distL="0">
             <wp:extent cx="5080000" cy="4241800"/>
-            <wp:docPr id="9" name="Drawing 9" descr="file:/tmp/%5BLDFB%5D%20%5BCTX%5D%20Run%20Cabin%20Intercommunication%20Service-m2doc2996073630709250717.jpg"/>
+            <wp:docPr id="9" name="Drawing 9" descr="file:/tmp/%5BLDFB%5D%20%5BCTX%5D%20Run%20Cabin%20Intercommunication%20Service-m2doc14861528142590118929.jpg"/>
             <a:graphic xmlns:a="http://schemas.openxmlformats.org/drawingml/2006/main">
               <a:graphicData uri="http://schemas.openxmlformats.org/drawingml/2006/picture">
                 <pic:pic xmlns:pic="http://schemas.openxmlformats.org/drawingml/2006/picture">
                   <pic:nvPicPr>
-                    <pic:cNvPr id="0" name="Picture 9" descr="file:/tmp/%5BLDFB%5D%20%5BCTX%5D%20Run%20Cabin%20Intercommunication%20Service-m2doc2996073630709250717.jpg"/>
+                    <pic:cNvPr id="0" name="Picture 9" descr="file:/tmp/%5BLDFB%5D%20%5BCTX%5D%20Run%20Cabin%20Intercommunication%20Service-m2doc14861528142590118929.jpg"/>
                     <pic:cNvPicPr>
                       <a:picLocks noChangeAspect="true"/>
                     </pic:cNvPicPr>
@@ -49788,12 +49788,12 @@
         <w:drawing>
           <wp:inline distT="0" distR="0" distB="0" distL="0">
             <wp:extent cx="5080000" cy="2527300"/>
-            <wp:docPr id="10" name="Drawing 10" descr="file:/tmp/%5BLDFB%5D%20%5BCTX%5D%20Manage%20Passenger%20Services%20Lifecycle-m2doc13090883489911626017.jpg"/>
+            <wp:docPr id="10" name="Drawing 10" descr="file:/tmp/%5BLDFB%5D%20%5BCTX%5D%20Manage%20Passenger%20Services%20Lifecycle-m2doc11040957064083595775.jpg"/>
             <a:graphic xmlns:a="http://schemas.openxmlformats.org/drawingml/2006/main">
               <a:graphicData uri="http://schemas.openxmlformats.org/drawingml/2006/picture">
                 <pic:pic xmlns:pic="http://schemas.openxmlformats.org/drawingml/2006/picture">
                   <pic:nvPicPr>
-                    <pic:cNvPr id="0" name="Picture 10" descr="file:/tmp/%5BLDFB%5D%20%5BCTX%5D%20Manage%20Passenger%20Services%20Lifecycle-m2doc13090883489911626017.jpg"/>
+                    <pic:cNvPr id="0" name="Picture 10" descr="file:/tmp/%5BLDFB%5D%20%5BCTX%5D%20Manage%20Passenger%20Services%20Lifecycle-m2doc11040957064083595775.jpg"/>
                     <pic:cNvPicPr>
                       <a:picLocks noChangeAspect="true"/>
                     </pic:cNvPicPr>
@@ -55303,13 +55303,13 @@
         <w:t/>
         <w:drawing>
           <wp:inline distT="0" distR="0" distB="0" distL="0">
-            <wp:extent cx="5080000" cy="2235200"/>
-            <wp:docPr id="11" name="Drawing 11" descr="file:/tmp/%5BCDB%5D%20In-Flight%20Entertainment%20Dictionary-m2doc2723436257197891609.jpg"/>
+            <wp:extent cx="5080000" cy="2286000"/>
+            <wp:docPr id="11" name="Drawing 11" descr="file:/tmp/%5BCDB%5D%20In-Flight%20Entertainment%20Dictionary-m2doc1055459674246240637.jpg"/>
             <a:graphic xmlns:a="http://schemas.openxmlformats.org/drawingml/2006/main">
               <a:graphicData uri="http://schemas.openxmlformats.org/drawingml/2006/picture">
                 <pic:pic xmlns:pic="http://schemas.openxmlformats.org/drawingml/2006/picture">
                   <pic:nvPicPr>
-                    <pic:cNvPr id="0" name="Picture 11" descr="file:/tmp/%5BCDB%5D%20In-Flight%20Entertainment%20Dictionary-m2doc2723436257197891609.jpg"/>
+                    <pic:cNvPr id="0" name="Picture 11" descr="file:/tmp/%5BCDB%5D%20In-Flight%20Entertainment%20Dictionary-m2doc1055459674246240637.jpg"/>
                     <pic:cNvPicPr>
                       <a:picLocks noChangeAspect="true"/>
                     </pic:cNvPicPr>
@@ -55323,7 +55323,7 @@
                   <pic:spPr>
                     <a:xfrm>
                       <a:off x="0" y="0"/>
-                      <a:ext cx="5080000" cy="2235200"/>
+                      <a:ext cx="5080000" cy="2286000"/>
                     </a:xfrm>
                     <a:prstGeom prst="rect">
                       <a:avLst/>

</xml_diff>